<commit_message>
Paper: author names, registration numbers and affiliation
</commit_message>
<xml_diff>
--- a/paper/collabdoc.docx
+++ b/paper/collabdoc.docx
@@ -58,7 +58,7 @@
                 <w:color w:val="000000"/>
                 <w:sz w:val="18"/>
               </w:rPr>
-              <w:t>[Department], [Institution]</w:t>
+              <w:t>Reg. No. 24BCE1520</w:t>
             </w:r>
           </w:p>
           <w:p>
@@ -73,7 +73,7 @@
                 <w:color w:val="000000"/>
                 <w:sz w:val="18"/>
               </w:rPr>
-              <w:t>[City, Country]</w:t>
+              <w:t>Vellore Institute of Technology, Chennai</w:t>
             </w:r>
           </w:p>
           <w:p>
@@ -88,7 +88,7 @@
                 <w:color w:val="000000"/>
                 <w:sz w:val="18"/>
               </w:rPr>
-              <w:t>nitish@admrls.com</w:t>
+              <w:t>Chennai, India</w:t>
             </w:r>
           </w:p>
         </w:tc>
@@ -121,7 +121,7 @@
                 <w:color w:val="000000"/>
                 <w:sz w:val="18"/>
               </w:rPr>
-              <w:t>[Department], [Institution]</w:t>
+              <w:t>Reg. No. 24BCE1594</w:t>
             </w:r>
           </w:p>
           <w:p>
@@ -136,7 +136,7 @@
                 <w:color w:val="000000"/>
                 <w:sz w:val="18"/>
               </w:rPr>
-              <w:t>[City, Country]</w:t>
+              <w:t>Vellore Institute of Technology, Chennai</w:t>
             </w:r>
           </w:p>
           <w:p>
@@ -151,7 +151,7 @@
                 <w:color w:val="000000"/>
                 <w:sz w:val="18"/>
               </w:rPr>
-              <w:t>[email]</w:t>
+              <w:t>Chennai, India</w:t>
             </w:r>
           </w:p>
         </w:tc>

</xml_diff>

<commit_message>
Paper: faculty name, demo-unavailable note, Word link
</commit_message>
<xml_diff>
--- a/paper/collabdoc.docx
+++ b/paper/collabdoc.docx
@@ -3510,7 +3510,7 @@
           <w:color w:val="000000"/>
           <w:sz w:val="20"/>
         </w:rPr>
-        <w:t xml:space="preserve">N. Kumar and B. N.,</w:t>
+        <w:t xml:space="preserve">N. Kumar, B. N. and S. Vigneshwari,</w:t>
       </w:r>
       <w:r>
         <w:rPr>
@@ -4508,7 +4508,7 @@
       </w:r>
     </w:p>
     <w:bookmarkEnd w:id="41"/>
-    <w:bookmarkStart w:id="43" w:name="project-links"/>
+    <w:bookmarkStart w:id="44" w:name="project-links"/>
     <w:p>
       <w:pPr>
         <w:pStyle w:val="Heading1"/>
@@ -4558,7 +4558,7 @@
           <w:color w:val="000000"/>
           <w:sz w:val="20"/>
         </w:rPr>
-        <w:t xml:space="preserve">[demo URL; the AWS stack is started and stopped on demand]</w:t>
+        <w:t xml:space="preserve">not available; the AWS stack was torn down when the AWS credits were used up, and it can be recreated from the repository with Terraform.</w:t>
       </w:r>
       <w:r>
         <w:rPr>
@@ -4592,7 +4592,7 @@
           <w:color w:val="000000"/>
           <w:sz w:val="20"/>
         </w:rPr>
-        <w:t xml:space="preserve">N. Kumar and B. N.,</w:t>
+        <w:t xml:space="preserve">N. Kumar, B. N. and S. Vigneshwari,</w:t>
       </w:r>
       <w:r>
         <w:rPr>
@@ -4660,17 +4660,25 @@
         </w:rPr>
         <w:t xml:space="preserve"> </w:t>
       </w:r>
-      <w:r>
-        <w:rPr>
-          <w:rFonts w:ascii="Times New Roman" w:hAnsi="Times New Roman" w:cs="Times New Roman" w:eastAsia="Times New Roman"/>
-          <w:color w:val="000000"/>
-          <w:sz w:val="20"/>
-        </w:rPr>
-        <w:t xml:space="preserve">[link, if provided].</w:t>
-      </w:r>
-    </w:p>
-    <w:bookmarkEnd w:id="43"/>
-    <w:bookmarkStart w:id="44" w:name="acknowledgment"/>
+      <w:hyperlink r:id="rId43">
+        <w:r>
+          <w:rPr>
+            <w:rStyle w:val="Hyperlink"/>
+          </w:rPr>
+          <w:t xml:space="preserve">https://github.com/Zerko-sd/CollabDoc/blob/main/paper/collabdoc.docx</w:t>
+        </w:r>
+      </w:hyperlink>
+      <w:r>
+        <w:rPr>
+          <w:rFonts w:ascii="Times New Roman" w:hAnsi="Times New Roman" w:cs="Times New Roman" w:eastAsia="Times New Roman"/>
+          <w:color w:val="000000"/>
+          <w:sz w:val="20"/>
+        </w:rPr>
+        <w:t xml:space="preserve">.</w:t>
+      </w:r>
+    </w:p>
+    <w:bookmarkEnd w:id="44"/>
+    <w:bookmarkStart w:id="45" w:name="acknowledgment"/>
     <w:p>
       <w:pPr>
         <w:pStyle w:val="Heading1"/>
@@ -4702,11 +4710,11 @@
           <w:color w:val="000000"/>
           <w:sz w:val="20"/>
         </w:rPr>
-        <w:t xml:space="preserve">The authors thank the faculty and reviewers whose feedback shaped this work.</w:t>
-      </w:r>
-    </w:p>
-    <w:bookmarkEnd w:id="44"/>
-    <w:bookmarkStart w:id="83" w:name="references"/>
+        <w:t xml:space="preserve">The authors thank their faculty guide, S. Vigneshwari, for guidance on this work.</w:t>
+      </w:r>
+    </w:p>
+    <w:bookmarkEnd w:id="45"/>
+    <w:bookmarkStart w:id="84" w:name="references"/>
     <w:p>
       <w:pPr>
         <w:pStyle w:val="Heading1"/>
@@ -4806,7 +4814,7 @@
         </w:rPr>
         <w:t xml:space="preserve"> </w:t>
       </w:r>
-      <w:hyperlink r:id="rId45">
+      <w:hyperlink r:id="rId46">
         <w:r>
           <w:rPr>
             <w:rStyle w:val="Hyperlink"/>
@@ -4880,7 +4888,7 @@
         </w:rPr>
         <w:t xml:space="preserve"> </w:t>
       </w:r>
-      <w:hyperlink r:id="rId46">
+      <w:hyperlink r:id="rId47">
         <w:r>
           <w:rPr>
             <w:rStyle w:val="Hyperlink"/>
@@ -4970,7 +4978,7 @@
         </w:rPr>
         <w:t xml:space="preserve"> </w:t>
       </w:r>
-      <w:hyperlink r:id="rId47">
+      <w:hyperlink r:id="rId48">
         <w:r>
           <w:rPr>
             <w:rStyle w:val="Hyperlink"/>
@@ -5060,7 +5068,7 @@
         </w:rPr>
         <w:t xml:space="preserve"> </w:t>
       </w:r>
-      <w:hyperlink r:id="rId48">
+      <w:hyperlink r:id="rId49">
         <w:r>
           <w:rPr>
             <w:rStyle w:val="Hyperlink"/>
@@ -5150,7 +5158,7 @@
         </w:rPr>
         <w:t xml:space="preserve"> </w:t>
       </w:r>
-      <w:hyperlink r:id="rId49">
+      <w:hyperlink r:id="rId50">
         <w:r>
           <w:rPr>
             <w:rStyle w:val="Hyperlink"/>
@@ -5240,7 +5248,7 @@
         </w:rPr>
         <w:t xml:space="preserve"> </w:t>
       </w:r>
-      <w:hyperlink r:id="rId50">
+      <w:hyperlink r:id="rId51">
         <w:r>
           <w:rPr>
             <w:rStyle w:val="Hyperlink"/>
@@ -5330,7 +5338,7 @@
         </w:rPr>
         <w:t xml:space="preserve"> </w:t>
       </w:r>
-      <w:hyperlink r:id="rId51">
+      <w:hyperlink r:id="rId52">
         <w:r>
           <w:rPr>
             <w:rStyle w:val="Hyperlink"/>
@@ -5404,7 +5412,7 @@
         </w:rPr>
         <w:t xml:space="preserve"> </w:t>
       </w:r>
-      <w:hyperlink r:id="rId52">
+      <w:hyperlink r:id="rId53">
         <w:r>
           <w:rPr>
             <w:rStyle w:val="Hyperlink"/>
@@ -5494,7 +5502,7 @@
         </w:rPr>
         <w:t xml:space="preserve"> </w:t>
       </w:r>
-      <w:hyperlink r:id="rId53">
+      <w:hyperlink r:id="rId54">
         <w:r>
           <w:rPr>
             <w:rStyle w:val="Hyperlink"/>
@@ -5568,7 +5576,7 @@
         </w:rPr>
         <w:t xml:space="preserve"> </w:t>
       </w:r>
-      <w:hyperlink r:id="rId54">
+      <w:hyperlink r:id="rId55">
         <w:r>
           <w:rPr>
             <w:rStyle w:val="Hyperlink"/>
@@ -5658,7 +5666,7 @@
         </w:rPr>
         <w:t xml:space="preserve"> </w:t>
       </w:r>
-      <w:hyperlink r:id="rId55">
+      <w:hyperlink r:id="rId56">
         <w:r>
           <w:rPr>
             <w:rStyle w:val="Hyperlink"/>
@@ -5748,7 +5756,7 @@
         </w:rPr>
         <w:t xml:space="preserve"> </w:t>
       </w:r>
-      <w:hyperlink r:id="rId56">
+      <w:hyperlink r:id="rId57">
         <w:r>
           <w:rPr>
             <w:rStyle w:val="Hyperlink"/>
@@ -5838,7 +5846,7 @@
         </w:rPr>
         <w:t xml:space="preserve"> </w:t>
       </w:r>
-      <w:hyperlink r:id="rId57">
+      <w:hyperlink r:id="rId58">
         <w:r>
           <w:rPr>
             <w:rStyle w:val="Hyperlink"/>
@@ -5928,7 +5936,7 @@
         </w:rPr>
         <w:t xml:space="preserve"> </w:t>
       </w:r>
-      <w:hyperlink r:id="rId58">
+      <w:hyperlink r:id="rId59">
         <w:r>
           <w:rPr>
             <w:rStyle w:val="Hyperlink"/>
@@ -6002,7 +6010,7 @@
         </w:rPr>
         <w:t xml:space="preserve"> </w:t>
       </w:r>
-      <w:hyperlink r:id="rId59">
+      <w:hyperlink r:id="rId60">
         <w:r>
           <w:rPr>
             <w:rStyle w:val="Hyperlink"/>
@@ -6076,7 +6084,7 @@
         </w:rPr>
         <w:t xml:space="preserve"> </w:t>
       </w:r>
-      <w:hyperlink r:id="rId60">
+      <w:hyperlink r:id="rId61">
         <w:r>
           <w:rPr>
             <w:rStyle w:val="Hyperlink"/>
@@ -6150,7 +6158,7 @@
         </w:rPr>
         <w:t xml:space="preserve"> </w:t>
       </w:r>
-      <w:hyperlink r:id="rId61">
+      <w:hyperlink r:id="rId62">
         <w:r>
           <w:rPr>
             <w:rStyle w:val="Hyperlink"/>
@@ -6224,7 +6232,7 @@
         </w:rPr>
         <w:t xml:space="preserve"> </w:t>
       </w:r>
-      <w:hyperlink r:id="rId62">
+      <w:hyperlink r:id="rId63">
         <w:r>
           <w:rPr>
             <w:rStyle w:val="Hyperlink"/>
@@ -6314,7 +6322,7 @@
         </w:rPr>
         <w:t xml:space="preserve"> </w:t>
       </w:r>
-      <w:hyperlink r:id="rId63">
+      <w:hyperlink r:id="rId64">
         <w:r>
           <w:rPr>
             <w:rStyle w:val="Hyperlink"/>
@@ -6414,7 +6422,7 @@
         </w:rPr>
         <w:t xml:space="preserve"> </w:t>
       </w:r>
-      <w:hyperlink r:id="rId64">
+      <w:hyperlink r:id="rId65">
         <w:r>
           <w:rPr>
             <w:rStyle w:val="Hyperlink"/>
@@ -6530,7 +6538,7 @@
         </w:rPr>
         <w:t xml:space="preserve"> </w:t>
       </w:r>
-      <w:hyperlink r:id="rId65">
+      <w:hyperlink r:id="rId66">
         <w:r>
           <w:rPr>
             <w:rStyle w:val="Hyperlink"/>
@@ -6604,7 +6612,7 @@
         </w:rPr>
         <w:t xml:space="preserve"> </w:t>
       </w:r>
-      <w:hyperlink r:id="rId66">
+      <w:hyperlink r:id="rId67">
         <w:r>
           <w:rPr>
             <w:rStyle w:val="Hyperlink"/>
@@ -6694,7 +6702,7 @@
         </w:rPr>
         <w:t xml:space="preserve"> </w:t>
       </w:r>
-      <w:hyperlink r:id="rId67">
+      <w:hyperlink r:id="rId68">
         <w:r>
           <w:rPr>
             <w:rStyle w:val="Hyperlink"/>
@@ -6768,7 +6776,7 @@
         </w:rPr>
         <w:t xml:space="preserve"> </w:t>
       </w:r>
-      <w:hyperlink r:id="rId68">
+      <w:hyperlink r:id="rId69">
         <w:r>
           <w:rPr>
             <w:rStyle w:val="Hyperlink"/>
@@ -6842,7 +6850,7 @@
         </w:rPr>
         <w:t xml:space="preserve"> </w:t>
       </w:r>
-      <w:hyperlink r:id="rId69">
+      <w:hyperlink r:id="rId70">
         <w:r>
           <w:rPr>
             <w:rStyle w:val="Hyperlink"/>
@@ -6916,7 +6924,7 @@
         </w:rPr>
         <w:t xml:space="preserve"> </w:t>
       </w:r>
-      <w:hyperlink r:id="rId70">
+      <w:hyperlink r:id="rId71">
         <w:r>
           <w:rPr>
             <w:rStyle w:val="Hyperlink"/>
@@ -6980,7 +6988,7 @@
         </w:rPr>
         <w:t xml:space="preserve"> </w:t>
       </w:r>
-      <w:hyperlink r:id="rId71">
+      <w:hyperlink r:id="rId72">
         <w:r>
           <w:rPr>
             <w:rStyle w:val="Hyperlink"/>
@@ -7096,7 +7104,7 @@
         </w:rPr>
         <w:t xml:space="preserve"> </w:t>
       </w:r>
-      <w:hyperlink r:id="rId72">
+      <w:hyperlink r:id="rId73">
         <w:r>
           <w:rPr>
             <w:rStyle w:val="Hyperlink"/>
@@ -7170,7 +7178,7 @@
         </w:rPr>
         <w:t xml:space="preserve"> </w:t>
       </w:r>
-      <w:hyperlink r:id="rId73">
+      <w:hyperlink r:id="rId74">
         <w:r>
           <w:rPr>
             <w:rStyle w:val="Hyperlink"/>
@@ -7234,7 +7242,7 @@
         </w:rPr>
         <w:t xml:space="preserve"> </w:t>
       </w:r>
-      <w:hyperlink r:id="rId74">
+      <w:hyperlink r:id="rId75">
         <w:r>
           <w:rPr>
             <w:rStyle w:val="Hyperlink"/>
@@ -7324,7 +7332,7 @@
         </w:rPr>
         <w:t xml:space="preserve"> </w:t>
       </w:r>
-      <w:hyperlink r:id="rId75">
+      <w:hyperlink r:id="rId76">
         <w:r>
           <w:rPr>
             <w:rStyle w:val="Hyperlink"/>
@@ -7398,7 +7406,7 @@
         </w:rPr>
         <w:t xml:space="preserve"> </w:t>
       </w:r>
-      <w:hyperlink r:id="rId76">
+      <w:hyperlink r:id="rId77">
         <w:r>
           <w:rPr>
             <w:rStyle w:val="Hyperlink"/>
@@ -7462,7 +7470,7 @@
         </w:rPr>
         <w:t xml:space="preserve"> </w:t>
       </w:r>
-      <w:hyperlink r:id="rId77">
+      <w:hyperlink r:id="rId78">
         <w:r>
           <w:rPr>
             <w:rStyle w:val="Hyperlink"/>
@@ -7526,7 +7534,7 @@
         </w:rPr>
         <w:t xml:space="preserve"> </w:t>
       </w:r>
-      <w:hyperlink r:id="rId78">
+      <w:hyperlink r:id="rId79">
         <w:r>
           <w:rPr>
             <w:rStyle w:val="Hyperlink"/>
@@ -7626,7 +7634,7 @@
         </w:rPr>
         <w:t xml:space="preserve"> </w:t>
       </w:r>
-      <w:hyperlink r:id="rId79">
+      <w:hyperlink r:id="rId80">
         <w:r>
           <w:rPr>
             <w:rStyle w:val="Hyperlink"/>
@@ -7674,7 +7682,7 @@
         </w:rPr>
         <w:t xml:space="preserve"> </w:t>
       </w:r>
-      <w:hyperlink r:id="rId80">
+      <w:hyperlink r:id="rId81">
         <w:r>
           <w:rPr>
             <w:rStyle w:val="Hyperlink"/>
@@ -7732,7 +7740,7 @@
         </w:rPr>
         <w:t xml:space="preserve"> </w:t>
       </w:r>
-      <w:hyperlink r:id="rId81">
+      <w:hyperlink r:id="rId82">
         <w:r>
           <w:rPr>
             <w:rStyle w:val="Hyperlink"/>
@@ -7822,7 +7830,7 @@
         </w:rPr>
         <w:t xml:space="preserve"> </w:t>
       </w:r>
-      <w:hyperlink r:id="rId82">
+      <w:hyperlink r:id="rId83">
         <w:r>
           <w:rPr>
             <w:rStyle w:val="Hyperlink"/>
@@ -7831,7 +7839,7 @@
         </w:r>
       </w:hyperlink>
     </w:p>
-    <w:bookmarkEnd w:id="83"/>
+    <w:bookmarkEnd w:id="84"/>
     <w:sectPr>
       <w:type w:val="continuous"/>
       <w:pgSz w:w="12240" w:h="15840"/>

</xml_diff>

<commit_message>
IEEE paper: course header, team members and logo on first page
</commit_message>
<xml_diff>
--- a/paper/collabdoc.docx
+++ b/paper/collabdoc.docx
@@ -3,6 +3,151 @@
 <w:document xmlns:w="http://schemas.openxmlformats.org/wordprocessingml/2006/main" xmlns:m="http://schemas.openxmlformats.org/officeDocument/2006/math" xmlns:r="http://schemas.openxmlformats.org/officeDocument/2006/relationships" xmlns:o="urn:schemas-microsoft-com:office:office" xmlns:v="urn:schemas-microsoft-com:vml" xmlns:w10="urn:schemas-microsoft-com:office:word" xmlns:a="http://schemas.openxmlformats.org/drawingml/2006/main" xmlns:pic="http://schemas.openxmlformats.org/drawingml/2006/picture" xmlns:wp="http://schemas.openxmlformats.org/drawingml/2006/wordprocessingDrawing">
   <w:body>
     <w:bookmarkStart w:id="9" w:name="i.-introduction"/>
+    <w:tbl>
+      <w:tblPr>
+        <w:tblW w:type="auto" w:w="0"/>
+        <w:tblLook w:firstColumn="1" w:firstRow="1" w:lastColumn="0" w:lastRow="0" w:noHBand="0" w:noVBand="1" w:val="04A0"/>
+        <w:tblBorders>
+          <w:top w:val="single" w:sz="4" w:color="000000"/>
+          <w:left w:val="single" w:sz="4" w:color="000000"/>
+          <w:bottom w:val="single" w:sz="4" w:color="000000"/>
+          <w:right w:val="single" w:sz="4" w:color="000000"/>
+          <w:insideH w:val="single" w:sz="4" w:color="000000"/>
+          <w:insideV w:val="single" w:sz="4" w:color="000000"/>
+        </w:tblBorders>
+      </w:tblPr>
+      <w:tblGrid>
+        <w:gridCol w:w="5220"/>
+        <w:gridCol w:w="5220"/>
+      </w:tblGrid>
+      <w:tr>
+        <w:tc>
+          <w:tcPr>
+            <w:tcW w:type="dxa" w:w="2160"/>
+          </w:tcPr>
+          <w:p>
+            <w:pPr>
+              <w:jc w:val="center"/>
+            </w:pPr>
+            <w:r>
+              <w:drawing>
+                <wp:inline>
+                  <wp:extent cx="1188720" cy="422910"/>
+                  <wp:docPr id="38" name="Picture 38"/>
+                  <wp:cNvGraphicFramePr>
+                    <a:graphicFrameLocks noChangeAspect="1"/>
+                  </wp:cNvGraphicFramePr>
+                  <a:graphic>
+                    <a:graphicData uri="http://schemas.openxmlformats.org/drawingml/2006/picture">
+                      <pic:pic>
+                        <pic:nvPicPr>
+                          <pic:cNvPr id="0" name="vitlogo.png"/>
+                          <pic:cNvPicPr/>
+                        </pic:nvPicPr>
+                        <pic:blipFill>
+                          <a:blip r:embed="rId9"/>
+                          <a:stretch>
+                            <a:fillRect/>
+                          </a:stretch>
+                        </pic:blipFill>
+                        <pic:spPr>
+                          <a:xfrm>
+                            <a:off x="0" y="0"/>
+                            <a:ext cx="1188720" cy="422910"/>
+                          </a:xfrm>
+                          <a:prstGeom prst="rect"/>
+                        </pic:spPr>
+                      </pic:pic>
+                    </a:graphicData>
+                  </a:graphic>
+                </wp:inline>
+              </w:drawing>
+            </w:r>
+          </w:p>
+        </w:tc>
+        <w:tc>
+          <w:tcPr>
+            <w:tcW w:type="dxa" w:w="7920"/>
+          </w:tcPr>
+          <w:p>
+            <w:pPr>
+              <w:spacing w:before="0" w:after="40"/>
+              <w:jc w:val="center"/>
+            </w:pPr>
+            <w:r>
+              <w:rPr>
+                <w:rFonts w:ascii="Times New Roman" w:hAnsi="Times New Roman" w:cs="Times New Roman" w:eastAsia="Times New Roman"/>
+                <w:b/>
+                <w:color w:val="000000"/>
+                <w:sz w:val="24"/>
+              </w:rPr>
+              <w:t>Vellore Institute of Technology, Chennai</w:t>
+            </w:r>
+          </w:p>
+          <w:p>
+            <w:pPr>
+              <w:spacing w:before="0" w:after="40"/>
+              <w:jc w:val="center"/>
+            </w:pPr>
+            <w:r>
+              <w:rPr>
+                <w:rFonts w:ascii="Times New Roman" w:hAnsi="Times New Roman" w:cs="Times New Roman" w:eastAsia="Times New Roman"/>
+                <w:b/>
+                <w:color w:val="000000"/>
+                <w:sz w:val="22"/>
+              </w:rPr>
+              <w:t>School of Computer Science and Engineering</w:t>
+            </w:r>
+          </w:p>
+          <w:p>
+            <w:pPr>
+              <w:spacing w:before="0" w:after="40"/>
+              <w:jc w:val="center"/>
+            </w:pPr>
+            <w:r>
+              <w:rPr>
+                <w:rFonts w:ascii="Times New Roman" w:hAnsi="Times New Roman" w:cs="Times New Roman" w:eastAsia="Times New Roman"/>
+                <w:b w:val="0"/>
+                <w:color w:val="000000"/>
+                <w:sz w:val="20"/>
+              </w:rPr>
+              <w:t>Course Code: BCSE355L    Course Name: Cloud Architecture Design</w:t>
+            </w:r>
+          </w:p>
+          <w:p>
+            <w:pPr>
+              <w:spacing w:before="0" w:after="40"/>
+              <w:jc w:val="center"/>
+            </w:pPr>
+            <w:r>
+              <w:rPr>
+                <w:rFonts w:ascii="Times New Roman" w:hAnsi="Times New Roman" w:cs="Times New Roman" w:eastAsia="Times New Roman"/>
+                <w:b w:val="0"/>
+                <w:color w:val="000000"/>
+                <w:sz w:val="20"/>
+              </w:rPr>
+              <w:t>Direct Assessment III    Max Marks: 10</w:t>
+            </w:r>
+          </w:p>
+        </w:tc>
+      </w:tr>
+    </w:tbl>
+    <w:p>
+      <w:pPr>
+        <w:spacing w:before="80" w:after="80"/>
+        <w:jc w:val="left"/>
+      </w:pPr>
+      <w:r>
+        <w:rPr>
+          <w:rFonts w:ascii="Times New Roman" w:hAnsi="Times New Roman" w:cs="Times New Roman" w:eastAsia="Times New Roman"/>
+          <w:b w:val="0"/>
+          <w:i w:val="0"/>
+          <w:color w:val="000000"/>
+          <w:sz w:val="18"/>
+        </w:rPr>
+        <w:t>Team members (Reg. ID, Name): 24BCE1520, Nitish Kumar;  24BCE1594, Balan N.   Faculty: S Vigneshwari</w:t>
+      </w:r>
+    </w:p>
     <w:p>
       <w:pPr>
         <w:spacing w:before="0" w:after="200"/>

</xml_diff>